<commit_message>
Add status flags, curated data-center layer, American English
</commit_message>
<xml_diff>
--- a/docs/Brazil_SCN_Progress_Memo.docx
+++ b/docs/Brazil_SCN_Progress_Memo.docx
@@ -62,7 +62,7 @@
           <w:sz w:val="17"/>
           <w:szCs w:val="17"/>
         </w:rPr>
-        <w:t xml:space="preserve">Prepared by Gia Nichole  ·  14 September 2026  ·  Workspace: ~/Projects/Brazil</w:t>
+        <w:t xml:space="preserve">Prepared by Gia Nichole  ·  September 14, 2026  ·  Workspace: ~/Projects/Brazil</w:t>
       </w:r>
     </w:p>
     <w:p>
@@ -127,7 +127,7 @@
                 <w:sz w:val="21"/>
                 <w:szCs w:val="21"/>
               </w:rPr>
-              <w:t xml:space="preserve">12 layers harmonised</w:t>
+              <w:t xml:space="preserve">12 layers harmonized</w:t>
             </w:r>
           </w:p>
           <w:p>
@@ -188,7 +188,7 @@
                 <w:sz w:val="16"/>
                 <w:szCs w:val="16"/>
               </w:rPr>
-              <w:t xml:space="preserve">H3 harmonisation, remote sensing, policy, optimisation</w:t>
+              <w:t xml:space="preserve">H3 harmonization, remote sensing, policy, optimization</w:t>
             </w:r>
           </w:p>
         </w:tc>
@@ -327,7 +327,7 @@
           <w:sz w:val="21"/>
           <w:szCs w:val="21"/>
         </w:rPr>
-        <w:t xml:space="preserve">The workspace began as a cleaning exercise on a Global Energy Monitor–style energy workbook for Brazil. It is now something larger: a reproducible siting pipeline that asks where hyperscale data-centre infrastructure can physically and lawfully go, and refuses to answer that question with price alone.</w:t>
+        <w:t xml:space="preserve">The workspace began as a cleaning exercise on a Global Energy Monitor–style energy workbook for Brazil. It is now something larger: a reproducible siting pipeline that asks where hyperscale data-center infrastructure can physically and lawfully go, and refuses to answer that question with price alone.</w:t>
       </w:r>
     </w:p>
     <w:p>
@@ -341,7 +341,7 @@
           <w:sz w:val="21"/>
           <w:szCs w:val="21"/>
         </w:rPr>
-        <w:t xml:space="preserve">The organising idea is a strict ordering. Every physical, environmental and legal layer is harmonised into the same spatial decision unit, hard constraints are applied to that unit, and only the cells that survive are scored against competing objectives. Cheap power does not buy its way past a protected area, an indigenous territory, a water body, or a degradation risk above threshold. Those are exclusions, not penalties — and they are applied before the optimiser sees the data.</w:t>
+        <w:t xml:space="preserve">The organizing idea is a strict ordering. Every physical, environmental and legal layer is harmonized into the same spatial decision unit, hard constraints are applied to that unit, and only the cells that survive are scored against competing objectives. Cheap power does not buy its way past a protected area, an indigenous territory, a water body, or a degradation risk above threshold. Those are exclusions, not penalties — and they are applied before the optimizer sees the data.</w:t>
       </w:r>
     </w:p>
     <w:p>
@@ -355,7 +355,7 @@
           <w:sz w:val="21"/>
           <w:szCs w:val="21"/>
         </w:rPr>
-        <w:t xml:space="preserve">The national layers cover all of Brazil. The four-phase case study runs on a 50 km × 50 km box in coastal Ceará, chosen because it is where the tension is sharpest: strong wind resource and subsea fibre landing, against the worst transmission headroom score in the national screening and a Caatinga biome that raises licensing sensitivity. If constraints bind anywhere, they bind here.</w:t>
+        <w:t xml:space="preserve">The national layers cover all of Brazil. The four-phase case study runs on a 50 km × 50 km box in coastal Ceará, chosen because it is where the tension is sharpest: strong wind resource and subsea fiber landing, against the worst transmission headroom score in the national screening and a Caatinga biome that raises licensing sensitivity. If constraints bind anywhere, they bind here.</w:t>
       </w:r>
     </w:p>
     <w:p>
@@ -390,7 +390,7 @@
           <w:sz w:val="21"/>
           <w:szCs w:val="21"/>
         </w:rPr>
-        <w:t xml:space="preserve">Twelve layers feed the pipeline — nine drawn from external sources, three derived inside the workspace. Figure 1 shows how they move from raw form into the harmonised layers and then into the four phases; the table that follows says what each one is and why it is there.</w:t>
+        <w:t xml:space="preserve">Twelve layers feed the pipeline — nine drawn from external sources, three derived inside the workspace. Figure 1 shows how they move from raw form into the harmonized layers and then into the four phases; the table that follows says what each one is and why it is there.</w:t>
       </w:r>
     </w:p>
     <w:p>
@@ -453,7 +453,7 @@
           <w:sz w:val="17"/>
           <w:szCs w:val="17"/>
         </w:rPr>
-        <w:t xml:space="preserve">Figure 1. Data flow from raw sources through the harmonised clean_data layers into the four Sovereign Compute Nexus phases. Green marks the remote-sensing path into Phase 2; orange marks the policy corpus path into Phase 3.</w:t>
+        <w:t xml:space="preserve">Figure 1. Data flow from raw sources through the harmonized clean_data layers into the four Sovereign Compute Nexus phases. Green marks the remote-sensing path into Phase 2; orange marks the policy corpus path into Phase 3.</w:t>
       </w:r>
     </w:p>
     <w:tbl>
@@ -973,7 +973,7 @@
                 <w:sz w:val="17"/>
                 <w:szCs w:val="17"/>
               </w:rPr>
-              <w:t xml:space="preserve">A rough first draft of the grid, kept only to sanity-check the official data below. It never decides where a data centre can go.</w:t>
+              <w:t xml:space="preserve">A rough first draft of the grid, kept only to sanity-check the official data below. It never decides where a data center can go.</w:t>
             </w:r>
           </w:p>
         </w:tc>
@@ -1173,7 +1173,7 @@
                 <w:sz w:val="17"/>
                 <w:szCs w:val="17"/>
               </w:rPr>
-              <w:t xml:space="preserve">Evidence that the waste is real and large: 63.5 TWh discarded out of 502.3 TWh produced. That wasted power is the opportunity a well-sited data centre could absorb.</w:t>
+              <w:t xml:space="preserve">Evidence that the waste is real and large: 63.5 TWh discarded out of 502.3 TWh produced. That wasted power is the opportunity a well-sited data center could absorb.</w:t>
             </w:r>
           </w:p>
         </w:tc>
@@ -1273,7 +1273,7 @@
                 <w:sz w:val="17"/>
                 <w:szCs w:val="17"/>
               </w:rPr>
-              <w:t xml:space="preserve">Lets us separate officially ordered curtailment from every other kind of shortfall (108.6 TWh in total), so each claim can be labelled with how solid the evidence behind it is.</w:t>
+              <w:t xml:space="preserve">Lets us separate officially ordered curtailment from every other kind of shortfall (108.6 TWh in total), so each claim can be labeled with how solid the evidence behind it is.</w:t>
             </w:r>
           </w:p>
         </w:tc>
@@ -1460,7 +1460,7 @@
                 <w:sz w:val="17"/>
                 <w:szCs w:val="17"/>
               </w:rPr>
-              <w:t xml:space="preserve">Where data centres already are</w:t>
+              <w:t xml:space="preserve">Where data centers already are</w:t>
             </w:r>
           </w:p>
         </w:tc>
@@ -1522,7 +1522,7 @@
                 <w:sz w:val="17"/>
                 <w:szCs w:val="17"/>
               </w:rPr>
-              <w:t xml:space="preserve">A stand-in for fibre. A new site has to sit near existing internet infrastructure, so distance to the nearest facility is both a hard limit and something the model tries to minimise.</w:t>
+              <w:t xml:space="preserve">A stand-in for fiber. A new site has to sit near existing internet infrastructure, so distance to the nearest facility is both a hard limit and something the model tries to minimize.</w:t>
             </w:r>
           </w:p>
         </w:tc>
@@ -1691,7 +1691,7 @@
                 <w:sz w:val="17"/>
                 <w:szCs w:val="17"/>
               </w:rPr>
-              <w:t xml:space="preserve">Two satellite-derived maps of Brazil at 30-metre detail for 2024: land cover (forest, pasture, city and 27 other categories) and surface water.</w:t>
+              <w:t xml:space="preserve">Two satellite-derived maps of Brazil at 30-meter detail for 2024: land cover (forest, pasture, city and 27 other categories) and surface water.</w:t>
             </w:r>
           </w:p>
         </w:tc>
@@ -1791,7 +1791,7 @@
                 <w:sz w:val="17"/>
                 <w:szCs w:val="17"/>
               </w:rPr>
-              <w:t xml:space="preserve">European Space Agency satellites, pulled through Google Earth Engine. Sentinel-2 sees colour and vegetation health; Sentinel-1 is radar and sees through cloud. Three-month snapshots from October 2021 to May 2026 at 10-metre detail, then averaged over each decision cell.</w:t>
+              <w:t xml:space="preserve">European Space Agency satellites, pulled through Google Earth Engine. Sentinel-2 sees color and vegetation health; Sentinel-1 is radar and sees through cloud. Three-month snapshots from October 2021 to May 2026 at 10-meter detail, then averaged over each decision cell.</w:t>
             </w:r>
           </w:p>
         </w:tc>
@@ -1940,7 +1940,7 @@
                 <w:sz w:val="17"/>
                 <w:szCs w:val="17"/>
               </w:rPr>
-              <w:t xml:space="preserve">36 hand-picked documents: 12 government sources on ReData and data-centre policy, 15 on indigenous rights, protected areas and environmental law, and 9 peer-reviewed articles.</w:t>
+              <w:t xml:space="preserve">36 hand-picked documents: 12 government sources on ReData and data-center policy, 15 on indigenous rights, protected areas and environmental law, and 9 peer-reviewed articles.</w:t>
             </w:r>
           </w:p>
         </w:tc>
@@ -2025,7 +2025,7 @@
           <w:sz w:val="21"/>
           <w:szCs w:val="21"/>
         </w:rPr>
-        <w:t xml:space="preserve">The phases are sequential and each one hands the next a narrower, better-characterised set of cells. Nothing downstream can widen what an earlier phase has excluded.</w:t>
+        <w:t xml:space="preserve">The phases are sequential and each one hands the next a narrower, better-characterized set of cells. Nothing downstream can widen what an earlier phase has excluded.</w:t>
       </w:r>
     </w:p>
     <w:tbl>
@@ -2150,7 +2150,7 @@
                 <w:sz w:val="17"/>
                 <w:szCs w:val="17"/>
               </w:rPr>
-              <w:t xml:space="preserve">Phase 1 — H3 harmonisation
+              <w:t xml:space="preserve">Phase 1 — H3 harmonization
 build_phase1_h3_baseline.py</w:t>
             </w:r>
           </w:p>
@@ -2182,7 +2182,7 @@
                 <w:sz w:val="17"/>
                 <w:szCs w:val="17"/>
               </w:rPr>
-              <w:t xml:space="preserve">Tiles a 50 km × 50 km box centred on −3.56, −38.82 in coastal Ceará into 2,808 H3 resolution-8 cells and joins every layer onto a single h3_id key. 1,686 cells are excluded immediately: 1,353 fall outside the state boundary, 254 overlap protected areas, 124 overlap indigenous land.</w:t>
+              <w:t xml:space="preserve">Tiles a 50 km × 50 km box centered on −3.56, −38.82 in coastal Ceará into 2,808 H3 resolution-8 cells and joins every layer onto a single h3_id key. 1,686 cells are excluded immediately: 1,353 fall outside the state boundary, 254 overlap protected areas, 124 overlap indigenous land.</w:t>
             </w:r>
           </w:p>
         </w:tc>
@@ -2363,7 +2363,7 @@
                 <w:sz w:val="17"/>
                 <w:szCs w:val="17"/>
               </w:rPr>
-              <w:t xml:space="preserve">Phase 4 — Constrained optimisation
+              <w:t xml:space="preserve">Phase 4 — Constrained optimization
 run_scn_phase4_optimization.py</w:t>
             </w:r>
           </w:p>
@@ -2396,7 +2396,7 @@
                 <w:sz w:val="17"/>
                 <w:szCs w:val="17"/>
               </w:rPr>
-              <w:t xml:space="preserve">Applies every hard constraint before scoring anything: policy must permit the cell, P_deg ≤ 0.62, and the cell must lie within 25 km of a high-voltage ONS bus, 15 km of an ONS line, and 50 km of a data-centre anchor. 819 cells survive; Pareto sorting over six minimised objectives leaves 448 non-dominated cells, from which 25 are ranked as a shortlist.</w:t>
+              <w:t xml:space="preserve">Applies every hard constraint before scoring anything: policy must permit the cell, P_deg ≤ 0.62, and the cell must lie within 25 km of a high-voltage ONS bus, 15 km of an ONS line, and 50 km of a data-center anchor. 819 cells survive; Pareto sorting over six minimized objectives leaves 448 non-dominated cells, from which 25 are ranked as a shortlist.</w:t>
             </w:r>
           </w:p>
         </w:tc>
@@ -2511,7 +2511,7 @@
           <w:sz w:val="21"/>
           <w:szCs w:val="21"/>
         </w:rPr>
-        <w:t xml:space="preserve">Figure 3 shows the same four phases as maps of the case-study box. Panel A is the legal screen; panel B is the Sentinel-derived degradation surface; panel C is the bounded policy classification; panel D is what the optimiser returns.</w:t>
+        <w:t xml:space="preserve">Figure 3 shows the same four phases as maps of the case-study box. Panel A is the legal screen; panel B is the Sentinel-derived degradation surface; panel C is the bounded policy classification; panel D is what the optimizer returns.</w:t>
       </w:r>
     </w:p>
     <w:p>
@@ -2822,7 +2822,7 @@
                 <w:sz w:val="17"/>
                 <w:szCs w:val="17"/>
               </w:rPr>
-              <w:t xml:space="preserve">Holding transmission fixed and adding 463,005 MW of proposed capacity takes overloaded branches from 1 to 236 and branches above 75% utilisation from 9 to 335. This is a stress proxy rather than a dispatch forecast, but it is the clearest argument that siting compute near curtailed generation is a grid question, not just a land question.</w:t>
+              <w:t xml:space="preserve">Holding transmission fixed and adding 463,005 MW of proposed capacity takes overloaded branches from 1 to 236 and branches above 75% utilization from 9 to 335. This is a stress proxy rather than a dispatch forecast, but it is the clearest argument that siting compute near curtailed generation is a grid question, not just a land question.</w:t>
             </w:r>
           </w:p>
         </w:tc>
@@ -2962,7 +2962,7 @@
                 <w:sz w:val="17"/>
                 <w:szCs w:val="17"/>
               </w:rPr>
-              <w:t xml:space="preserve">São Paulo (86.1), Minas Gerais (74.8), Paraná (71.3) and Rio Grande do Sul (70.8) form Tier 1 on market depth and grid access. Ceará ranks 7th at 64.0 — strong on subsea fibre and renewable resource, penalised on transmission headroom (0.07 of 1) and biome sensitivity — which is precisely why it is the interesting test of whether constraints bind.</w:t>
+              <w:t xml:space="preserve">São Paulo (86.1), Minas Gerais (74.8), Paraná (71.3) and Rio Grande do Sul (70.8) form Tier 1 on market depth and grid access. Ceará ranks 7th at 64.0 — strong on subsea fiber and renewable resource, penalized on transmission headroom (0.07 of 1) and biome sensitivity — which is precisely why it is the interesting test of whether constraints bind.</w:t>
             </w:r>
           </w:p>
         </w:tc>
@@ -3064,7 +3064,7 @@
           <w:sz w:val="21"/>
           <w:szCs w:val="21"/>
         </w:rPr>
-        <w:t xml:space="preserve">The shape of the trade-off within the feasible set is worth a look on its own. Figure 4 plots the two objective pairs that discriminate most. The left panel shows the familiar tension between grid interconnection cost and fibre proximity, with the shortlist clustering where both are cheap. The right panel is more surprising: the feasible cells split into two distinct populations on renewable energy shortfall — one cluster near the large wind complexes at roughly 0.50, another near 0.92 — with almost nothing between them. Siting in this box is effectively a binary choice about which cluster to join, not a continuous trade.</w:t>
+        <w:t xml:space="preserve">The shape of the trade-off within the feasible set is worth a look on its own. Figure 4 plots the two objective pairs that discriminate most. The left panel shows the familiar tension between grid interconnection cost and fiber proximity, with the shortlist clustering where both are cheap. The right panel is more surprising: the feasible cells split into two distinct populations on renewable energy shortfall — one cluster near the large wind complexes at roughly 0.50, another near 0.92 — with almost nothing between them. Siting in this box is effectively a binary choice about which cluster to join, not a continuous trade.</w:t>
       </w:r>
     </w:p>
     <w:p>
@@ -3127,7 +3127,7 @@
           <w:sz w:val="17"/>
           <w:szCs w:val="17"/>
         </w:rPr>
-        <w:t xml:space="preserve">Figure 4. Objective trade-offs across the 819 feasible cells. All objectives are minimised, so lower-left is better in both panels.</w:t>
+        <w:t xml:space="preserve">Figure 4. Objective trade-offs across the 819 feasible cells. All objectives are minimized, so lower-left is better in both panels.</w:t>
       </w:r>
     </w:p>
     <w:p>
@@ -3330,7 +3330,7 @@
           <w:sz w:val="21"/>
           <w:szCs w:val="21"/>
         </w:rPr>
-        <w:t xml:space="preserve">The README reports 22,874 rows processed in the energy cleaning step; cleaning_report.json sums to 22,323 across the 19 sheets. It also describes the Phase 3 corpus as 15 ReData / data-centre sources and 12 land-protection sources, but both the corpus JSON categories and the order of the corpus Markdown table give 12 and 15 — the two figures are transposed. Small, but these are exactly the numbers that get quoted.</w:t>
+        <w:t xml:space="preserve">The README reports 22,874 rows processed in the energy cleaning step; cleaning_report.json sums to 22,323 across the 19 sheets. It also describes the Phase 3 corpus as 15 ReData / data-center sources and 12 land-protection sources, but both the corpus JSON categories and the order of the corpus Markdown table give 12 and 15 — the two figures are transposed. Small, but these are exactly the numbers that get quoted.</w:t>
       </w:r>
     </w:p>
     <w:p>
@@ -3445,7 +3445,7 @@
           <w:sz w:val="21"/>
           <w:szCs w:val="21"/>
         </w:rPr>
-        <w:t xml:space="preserve">Grid stress is modelled with DC power-flow approximations, not full AC optimal power flow, and the proposed-generation scenario includes no new transmission or market dispatch.</w:t>
+        <w:t xml:space="preserve">Grid stress is modeled with DC power-flow approximations, not full AC optimal power flow, and the proposed-generation scenario includes no new transmission or market dispatch.</w:t>
       </w:r>
     </w:p>
     <w:p>
@@ -3483,7 +3483,7 @@
           <w:sz w:val="21"/>
           <w:szCs w:val="21"/>
         </w:rPr>
-        <w:t xml:space="preserve">The state-level investor suitability score excludes tariffs, land costs, tax incentives, water permits, fibre contracts, interconnection queues and permitting timelines.</w:t>
+        <w:t xml:space="preserve">The state-level investor suitability score excludes tariffs, land costs, tax incentives, water permits, fiber contracts, interconnection queues and permitting timelines.</w:t>
       </w:r>
     </w:p>
     <w:p>
@@ -3701,7 +3701,7 @@
                 <w:sz w:val="17"/>
                 <w:szCs w:val="17"/>
               </w:rPr>
-              <w:t xml:space="preserve">All harmonised outputs, one subdirectory per layer, each with a GeoPackage or CSV plus an interactive HTML map.</w:t>
+              <w:t xml:space="preserve">All harmonized outputs, one subdirectory per layer, each with a GeoPackage or CSV plus an interactive HTML map.</w:t>
             </w:r>
           </w:p>
         </w:tc>

</xml_diff>